<commit_message>
Add complete human decision document package
</commit_message>
<xml_diff>
--- a/portal_materials/DEF-002_kanonikus_auditjelentes_review.docx
+++ b/portal_materials/DEF-002_kanonikus_auditjelentes_review.docx
@@ -274,6 +274,55 @@
                 <w:color w:val="0B2545"/>
                 <w:sz w:val="22"/>
               </w:rPr>
+              <w:t>Végrehajtási hullám</w:t>
+            </w:r>
+          </w:p>
+        </w:tc>
+        <w:tc>
+          <w:tcPr>
+            <w:tcW w:type="dxa" w:w="6660"/>
+            <w:vAlign w:val="center"/>
+            <w:tcMar>
+              <w:top w:w="80" w:type="dxa"/>
+              <w:bottom w:w="80" w:type="dxa"/>
+              <w:start w:w="120" w:type="dxa"/>
+              <w:end w:w="120" w:type="dxa"/>
+            </w:tcMar>
+          </w:tcPr>
+          <w:p>
+            <w:r>
+              <w:rPr>
+                <w:rFonts w:ascii="Calibri" w:hAnsi="Calibri"/>
+                <w:b w:val="0"/>
+                <w:color w:val="000000"/>
+                <w:sz w:val="22"/>
+              </w:rPr>
+              <w:t>W1</w:t>
+            </w:r>
+          </w:p>
+        </w:tc>
+      </w:tr>
+      <w:tr>
+        <w:tc>
+          <w:tcPr>
+            <w:tcW w:type="dxa" w:w="2700"/>
+            <w:vAlign w:val="center"/>
+            <w:tcMar>
+              <w:top w:w="80" w:type="dxa"/>
+              <w:bottom w:w="80" w:type="dxa"/>
+              <w:start w:w="120" w:type="dxa"/>
+              <w:end w:w="120" w:type="dxa"/>
+            </w:tcMar>
+            <w:shd w:fill="E8EEF5"/>
+          </w:tcPr>
+          <w:p>
+            <w:r>
+              <w:rPr>
+                <w:rFonts w:ascii="Calibri" w:hAnsi="Calibri"/>
+                <w:b/>
+                <w:color w:val="0B2545"/>
+                <w:sz w:val="22"/>
+              </w:rPr>
               <w:t>Kitöltés dátuma</w:t>
             </w:r>
           </w:p>
@@ -314,6 +363,32 @@
     <w:p>
       <w:r>
         <w:t>Annak írásos megerősítése, hogy az aláírt auditjelentés és a D-025 döntési rekord ugyanarra a használható, kanonikus példányra vonatkozik.</w:t>
+      </w:r>
+    </w:p>
+    <w:p>
+      <w:pPr>
+        <w:pStyle w:val="Heading2"/>
+      </w:pPr>
+      <w:r>
+        <w:t>Jelenlegi, igazolt folyamatállapot</w:t>
+      </w:r>
+    </w:p>
+    <w:p>
+      <w:r>
+        <w:t>Az SRC-008 kanonikus forrásként használható; védett SharePoint-hivatkozása 2026-07-23-án rögzítve.</w:t>
+      </w:r>
+    </w:p>
+    <w:p>
+      <w:pPr>
+        <w:pStyle w:val="Heading2"/>
+      </w:pPr>
+      <w:r>
+        <w:t>Döntési kapu</w:t>
+      </w:r>
+    </w:p>
+    <w:p>
+      <w:r>
+        <w:t>Külső benyújtás előtt.</w:t>
       </w:r>
     </w:p>
     <w:p>
@@ -391,6 +466,10 @@
         <w:gridCol w:w="1620"/>
       </w:tblGrid>
       <w:tr>
+        <w:trPr>
+          <w:tblHeader w:val="true"/>
+          <w:cantSplit/>
+        </w:trPr>
         <w:tc>
           <w:tcPr>
             <w:tcW w:type="dxa" w:w="6120"/>
@@ -465,6 +544,9 @@
         </w:tc>
       </w:tr>
       <w:tr>
+        <w:trPr>
+          <w:cantSplit/>
+        </w:trPr>
         <w:tc>
           <w:tcPr>
             <w:tcW w:type="dxa" w:w="6120"/>
@@ -536,6 +618,9 @@
         </w:tc>
       </w:tr>
       <w:tr>
+        <w:trPr>
+          <w:cantSplit/>
+        </w:trPr>
         <w:tc>
           <w:tcPr>
             <w:tcW w:type="dxa" w:w="6120"/>
@@ -607,6 +692,9 @@
         </w:tc>
       </w:tr>
       <w:tr>
+        <w:trPr>
+          <w:cantSplit/>
+        </w:trPr>
         <w:tc>
           <w:tcPr>
             <w:tcW w:type="dxa" w:w="6120"/>
@@ -678,6 +766,9 @@
         </w:tc>
       </w:tr>
       <w:tr>
+        <w:trPr>
+          <w:cantSplit/>
+        </w:trPr>
         <w:tc>
           <w:tcPr>
             <w:tcW w:type="dxa" w:w="6120"/>
@@ -804,6 +895,404 @@
         <w:pStyle w:val="Heading2"/>
       </w:pPr>
       <w:r>
+        <w:t>Mellékletek és evidenciák</w:t>
+      </w:r>
+    </w:p>
+    <w:tbl>
+      <w:tblPr>
+        <w:tblStyle w:val="TableGrid"/>
+        <w:tblW w:type="dxa" w:w="9360"/>
+        <w:jc w:val="left"/>
+        <w:tblLayout w:type="fixed"/>
+        <w:tblLook w:firstColumn="1" w:firstRow="1" w:lastColumn="0" w:lastRow="0" w:noHBand="0" w:noVBand="1" w:val="04A0"/>
+        <w:tblInd w:w="120" w:type="dxa"/>
+      </w:tblPr>
+      <w:tblGrid>
+        <w:gridCol w:w="2700"/>
+        <w:gridCol w:w="3780"/>
+        <w:gridCol w:w="2880"/>
+      </w:tblGrid>
+      <w:tr>
+        <w:trPr>
+          <w:tblHeader w:val="true"/>
+          <w:cantSplit/>
+        </w:trPr>
+        <w:tc>
+          <w:tcPr>
+            <w:tcW w:type="dxa" w:w="2700"/>
+            <w:vAlign w:val="center"/>
+            <w:tcMar>
+              <w:top w:w="80" w:type="dxa"/>
+              <w:bottom w:w="80" w:type="dxa"/>
+              <w:start w:w="120" w:type="dxa"/>
+              <w:end w:w="120" w:type="dxa"/>
+            </w:tcMar>
+            <w:shd w:fill="E8EEF5"/>
+          </w:tcPr>
+          <w:p>
+            <w:r>
+              <w:rPr>
+                <w:rFonts w:ascii="Calibri" w:hAnsi="Calibri"/>
+                <w:b/>
+                <w:color w:val="0B2545"/>
+                <w:sz w:val="22"/>
+              </w:rPr>
+              <w:t>Dokumentum / evidencia</w:t>
+            </w:r>
+          </w:p>
+        </w:tc>
+        <w:tc>
+          <w:tcPr>
+            <w:tcW w:type="dxa" w:w="3780"/>
+            <w:vAlign w:val="center"/>
+            <w:tcMar>
+              <w:top w:w="80" w:type="dxa"/>
+              <w:bottom w:w="80" w:type="dxa"/>
+              <w:start w:w="120" w:type="dxa"/>
+              <w:end w:w="120" w:type="dxa"/>
+            </w:tcMar>
+            <w:shd w:fill="E8EEF5"/>
+          </w:tcPr>
+          <w:p>
+            <w:r>
+              <w:rPr>
+                <w:rFonts w:ascii="Calibri" w:hAnsi="Calibri"/>
+                <w:b/>
+                <w:color w:val="0B2545"/>
+                <w:sz w:val="22"/>
+              </w:rPr>
+              <w:t>Védett URI</w:t>
+            </w:r>
+          </w:p>
+        </w:tc>
+        <w:tc>
+          <w:tcPr>
+            <w:tcW w:type="dxa" w:w="2880"/>
+            <w:vAlign w:val="center"/>
+            <w:tcMar>
+              <w:top w:w="80" w:type="dxa"/>
+              <w:bottom w:w="80" w:type="dxa"/>
+              <w:start w:w="120" w:type="dxa"/>
+              <w:end w:w="120" w:type="dxa"/>
+            </w:tcMar>
+            <w:shd w:fill="E8EEF5"/>
+          </w:tcPr>
+          <w:p>
+            <w:r>
+              <w:rPr>
+                <w:rFonts w:ascii="Calibri" w:hAnsi="Calibri"/>
+                <w:b/>
+                <w:color w:val="0B2545"/>
+                <w:sz w:val="22"/>
+              </w:rPr>
+              <w:t>SHA-256 / megjegyzés</w:t>
+            </w:r>
+          </w:p>
+        </w:tc>
+      </w:tr>
+      <w:tr>
+        <w:trPr>
+          <w:cantSplit/>
+        </w:trPr>
+        <w:tc>
+          <w:tcPr>
+            <w:tcW w:type="dxa" w:w="2700"/>
+            <w:vAlign w:val="center"/>
+            <w:tcMar>
+              <w:top w:w="80" w:type="dxa"/>
+              <w:bottom w:w="80" w:type="dxa"/>
+              <w:start w:w="120" w:type="dxa"/>
+              <w:end w:w="120" w:type="dxa"/>
+            </w:tcMar>
+          </w:tcPr>
+          <w:p>
+            <w:r>
+              <w:rPr>
+                <w:rFonts w:ascii="Calibri" w:hAnsi="Calibri"/>
+                <w:b w:val="0"/>
+                <w:color w:val="000000"/>
+                <w:sz w:val="22"/>
+              </w:rPr>
+              <w:t>1. __________________</w:t>
+            </w:r>
+          </w:p>
+        </w:tc>
+        <w:tc>
+          <w:tcPr>
+            <w:tcW w:type="dxa" w:w="3780"/>
+            <w:vAlign w:val="center"/>
+            <w:tcMar>
+              <w:top w:w="80" w:type="dxa"/>
+              <w:bottom w:w="80" w:type="dxa"/>
+              <w:start w:w="120" w:type="dxa"/>
+              <w:end w:w="120" w:type="dxa"/>
+            </w:tcMar>
+          </w:tcPr>
+          <w:p>
+            <w:r>
+              <w:rPr>
+                <w:rFonts w:ascii="Calibri" w:hAnsi="Calibri"/>
+                <w:b w:val="0"/>
+                <w:color w:val="000000"/>
+                <w:sz w:val="22"/>
+              </w:rPr>
+              <w:t>________________________</w:t>
+            </w:r>
+          </w:p>
+        </w:tc>
+        <w:tc>
+          <w:tcPr>
+            <w:tcW w:type="dxa" w:w="2880"/>
+            <w:vAlign w:val="center"/>
+            <w:tcMar>
+              <w:top w:w="80" w:type="dxa"/>
+              <w:bottom w:w="80" w:type="dxa"/>
+              <w:start w:w="120" w:type="dxa"/>
+              <w:end w:w="120" w:type="dxa"/>
+            </w:tcMar>
+          </w:tcPr>
+          <w:p>
+            <w:r>
+              <w:rPr>
+                <w:rFonts w:ascii="Calibri" w:hAnsi="Calibri"/>
+                <w:b w:val="0"/>
+                <w:color w:val="000000"/>
+                <w:sz w:val="22"/>
+              </w:rPr>
+              <w:t>__________________</w:t>
+            </w:r>
+          </w:p>
+        </w:tc>
+      </w:tr>
+      <w:tr>
+        <w:trPr>
+          <w:cantSplit/>
+        </w:trPr>
+        <w:tc>
+          <w:tcPr>
+            <w:tcW w:type="dxa" w:w="2700"/>
+            <w:vAlign w:val="center"/>
+            <w:tcMar>
+              <w:top w:w="80" w:type="dxa"/>
+              <w:bottom w:w="80" w:type="dxa"/>
+              <w:start w:w="120" w:type="dxa"/>
+              <w:end w:w="120" w:type="dxa"/>
+            </w:tcMar>
+          </w:tcPr>
+          <w:p>
+            <w:r>
+              <w:rPr>
+                <w:rFonts w:ascii="Calibri" w:hAnsi="Calibri"/>
+                <w:b w:val="0"/>
+                <w:color w:val="000000"/>
+                <w:sz w:val="22"/>
+              </w:rPr>
+              <w:t>2. __________________</w:t>
+            </w:r>
+          </w:p>
+        </w:tc>
+        <w:tc>
+          <w:tcPr>
+            <w:tcW w:type="dxa" w:w="3780"/>
+            <w:vAlign w:val="center"/>
+            <w:tcMar>
+              <w:top w:w="80" w:type="dxa"/>
+              <w:bottom w:w="80" w:type="dxa"/>
+              <w:start w:w="120" w:type="dxa"/>
+              <w:end w:w="120" w:type="dxa"/>
+            </w:tcMar>
+          </w:tcPr>
+          <w:p>
+            <w:r>
+              <w:rPr>
+                <w:rFonts w:ascii="Calibri" w:hAnsi="Calibri"/>
+                <w:b w:val="0"/>
+                <w:color w:val="000000"/>
+                <w:sz w:val="22"/>
+              </w:rPr>
+              <w:t>________________________</w:t>
+            </w:r>
+          </w:p>
+        </w:tc>
+        <w:tc>
+          <w:tcPr>
+            <w:tcW w:type="dxa" w:w="2880"/>
+            <w:vAlign w:val="center"/>
+            <w:tcMar>
+              <w:top w:w="80" w:type="dxa"/>
+              <w:bottom w:w="80" w:type="dxa"/>
+              <w:start w:w="120" w:type="dxa"/>
+              <w:end w:w="120" w:type="dxa"/>
+            </w:tcMar>
+          </w:tcPr>
+          <w:p>
+            <w:r>
+              <w:rPr>
+                <w:rFonts w:ascii="Calibri" w:hAnsi="Calibri"/>
+                <w:b w:val="0"/>
+                <w:color w:val="000000"/>
+                <w:sz w:val="22"/>
+              </w:rPr>
+              <w:t>__________________</w:t>
+            </w:r>
+          </w:p>
+        </w:tc>
+      </w:tr>
+      <w:tr>
+        <w:trPr>
+          <w:cantSplit/>
+        </w:trPr>
+        <w:tc>
+          <w:tcPr>
+            <w:tcW w:type="dxa" w:w="2700"/>
+            <w:vAlign w:val="center"/>
+            <w:tcMar>
+              <w:top w:w="80" w:type="dxa"/>
+              <w:bottom w:w="80" w:type="dxa"/>
+              <w:start w:w="120" w:type="dxa"/>
+              <w:end w:w="120" w:type="dxa"/>
+            </w:tcMar>
+          </w:tcPr>
+          <w:p>
+            <w:r>
+              <w:rPr>
+                <w:rFonts w:ascii="Calibri" w:hAnsi="Calibri"/>
+                <w:b w:val="0"/>
+                <w:color w:val="000000"/>
+                <w:sz w:val="22"/>
+              </w:rPr>
+              <w:t>3. __________________</w:t>
+            </w:r>
+          </w:p>
+        </w:tc>
+        <w:tc>
+          <w:tcPr>
+            <w:tcW w:type="dxa" w:w="3780"/>
+            <w:vAlign w:val="center"/>
+            <w:tcMar>
+              <w:top w:w="80" w:type="dxa"/>
+              <w:bottom w:w="80" w:type="dxa"/>
+              <w:start w:w="120" w:type="dxa"/>
+              <w:end w:w="120" w:type="dxa"/>
+            </w:tcMar>
+          </w:tcPr>
+          <w:p>
+            <w:r>
+              <w:rPr>
+                <w:rFonts w:ascii="Calibri" w:hAnsi="Calibri"/>
+                <w:b w:val="0"/>
+                <w:color w:val="000000"/>
+                <w:sz w:val="22"/>
+              </w:rPr>
+              <w:t>________________________</w:t>
+            </w:r>
+          </w:p>
+        </w:tc>
+        <w:tc>
+          <w:tcPr>
+            <w:tcW w:type="dxa" w:w="2880"/>
+            <w:vAlign w:val="center"/>
+            <w:tcMar>
+              <w:top w:w="80" w:type="dxa"/>
+              <w:bottom w:w="80" w:type="dxa"/>
+              <w:start w:w="120" w:type="dxa"/>
+              <w:end w:w="120" w:type="dxa"/>
+            </w:tcMar>
+          </w:tcPr>
+          <w:p>
+            <w:r>
+              <w:rPr>
+                <w:rFonts w:ascii="Calibri" w:hAnsi="Calibri"/>
+                <w:b w:val="0"/>
+                <w:color w:val="000000"/>
+                <w:sz w:val="22"/>
+              </w:rPr>
+              <w:t>__________________</w:t>
+            </w:r>
+          </w:p>
+        </w:tc>
+      </w:tr>
+      <w:tr>
+        <w:trPr>
+          <w:cantSplit/>
+        </w:trPr>
+        <w:tc>
+          <w:tcPr>
+            <w:tcW w:type="dxa" w:w="2700"/>
+            <w:vAlign w:val="center"/>
+            <w:tcMar>
+              <w:top w:w="80" w:type="dxa"/>
+              <w:bottom w:w="80" w:type="dxa"/>
+              <w:start w:w="120" w:type="dxa"/>
+              <w:end w:w="120" w:type="dxa"/>
+            </w:tcMar>
+          </w:tcPr>
+          <w:p>
+            <w:r>
+              <w:rPr>
+                <w:rFonts w:ascii="Calibri" w:hAnsi="Calibri"/>
+                <w:b w:val="0"/>
+                <w:color w:val="000000"/>
+                <w:sz w:val="22"/>
+              </w:rPr>
+              <w:t>4. __________________</w:t>
+            </w:r>
+          </w:p>
+        </w:tc>
+        <w:tc>
+          <w:tcPr>
+            <w:tcW w:type="dxa" w:w="3780"/>
+            <w:vAlign w:val="center"/>
+            <w:tcMar>
+              <w:top w:w="80" w:type="dxa"/>
+              <w:bottom w:w="80" w:type="dxa"/>
+              <w:start w:w="120" w:type="dxa"/>
+              <w:end w:w="120" w:type="dxa"/>
+            </w:tcMar>
+          </w:tcPr>
+          <w:p>
+            <w:r>
+              <w:rPr>
+                <w:rFonts w:ascii="Calibri" w:hAnsi="Calibri"/>
+                <w:b w:val="0"/>
+                <w:color w:val="000000"/>
+                <w:sz w:val="22"/>
+              </w:rPr>
+              <w:t>________________________</w:t>
+            </w:r>
+          </w:p>
+        </w:tc>
+        <w:tc>
+          <w:tcPr>
+            <w:tcW w:type="dxa" w:w="2880"/>
+            <w:vAlign w:val="center"/>
+            <w:tcMar>
+              <w:top w:w="80" w:type="dxa"/>
+              <w:bottom w:w="80" w:type="dxa"/>
+              <w:start w:w="120" w:type="dxa"/>
+              <w:end w:w="120" w:type="dxa"/>
+            </w:tcMar>
+          </w:tcPr>
+          <w:p>
+            <w:r>
+              <w:rPr>
+                <w:rFonts w:ascii="Calibri" w:hAnsi="Calibri"/>
+                <w:b w:val="0"/>
+                <w:color w:val="000000"/>
+                <w:sz w:val="22"/>
+              </w:rPr>
+              <w:t>__________________</w:t>
+            </w:r>
+          </w:p>
+        </w:tc>
+      </w:tr>
+    </w:tbl>
+    <w:p>
+      <w:pPr>
+        <w:pStyle w:val="Heading2"/>
+        <w:keepNext/>
+      </w:pPr>
+      <w:r>
         <w:t>Döntés</w:t>
       </w:r>
     </w:p>
@@ -817,13 +1306,17 @@
         <w:tblInd w:w="120" w:type="dxa"/>
       </w:tblPr>
       <w:tblGrid>
-        <w:gridCol w:w="4680"/>
-        <w:gridCol w:w="4680"/>
+        <w:gridCol w:w="3120"/>
+        <w:gridCol w:w="3120"/>
+        <w:gridCol w:w="3120"/>
       </w:tblGrid>
       <w:tr>
+        <w:trPr>
+          <w:cantSplit/>
+        </w:trPr>
         <w:tc>
           <w:tcPr>
-            <w:tcW w:type="dxa" w:w="4680"/>
+            <w:tcW w:type="dxa" w:w="3120"/>
             <w:vAlign w:val="center"/>
             <w:tcMar>
               <w:top w:w="80" w:type="dxa"/>
@@ -833,6 +1326,9 @@
             </w:tcMar>
           </w:tcPr>
           <w:p>
+            <w:pPr>
+              <w:keepNext/>
+            </w:pPr>
             <w:r>
               <w:rPr>
                 <w:rFonts w:ascii="Calibri" w:hAnsi="Calibri"/>
@@ -846,7 +1342,7 @@
         </w:tc>
         <w:tc>
           <w:tcPr>
-            <w:tcW w:type="dxa" w:w="4680"/>
+            <w:tcW w:type="dxa" w:w="3120"/>
             <w:vAlign w:val="center"/>
             <w:tcMar>
               <w:top w:w="80" w:type="dxa"/>
@@ -856,6 +1352,35 @@
             </w:tcMar>
           </w:tcPr>
           <w:p>
+            <w:pPr>
+              <w:keepNext/>
+            </w:pPr>
+            <w:r>
+              <w:rPr>
+                <w:rFonts w:ascii="Calibri" w:hAnsi="Calibri"/>
+                <w:b/>
+                <w:color w:val="000000"/>
+                <w:sz w:val="22"/>
+              </w:rPr>
+              <w:t>Feltételekkel elfogadható</w:t>
+            </w:r>
+          </w:p>
+        </w:tc>
+        <w:tc>
+          <w:tcPr>
+            <w:tcW w:type="dxa" w:w="3120"/>
+            <w:vAlign w:val="center"/>
+            <w:tcMar>
+              <w:top w:w="80" w:type="dxa"/>
+              <w:bottom w:w="80" w:type="dxa"/>
+              <w:start w:w="120" w:type="dxa"/>
+              <w:end w:w="120" w:type="dxa"/>
+            </w:tcMar>
+          </w:tcPr>
+          <w:p>
+            <w:pPr>
+              <w:keepNext/>
+            </w:pPr>
             <w:r>
               <w:rPr>
                 <w:rFonts w:ascii="Calibri" w:hAnsi="Calibri"/>
@@ -869,9 +1394,12 @@
         </w:tc>
       </w:tr>
       <w:tr>
+        <w:trPr>
+          <w:cantSplit/>
+        </w:trPr>
         <w:tc>
           <w:tcPr>
-            <w:tcW w:type="dxa" w:w="4680"/>
+            <w:tcW w:type="dxa" w:w="3120"/>
             <w:vAlign w:val="center"/>
             <w:tcMar>
               <w:top w:w="80" w:type="dxa"/>
@@ -894,7 +1422,30 @@
         </w:tc>
         <w:tc>
           <w:tcPr>
-            <w:tcW w:type="dxa" w:w="4680"/>
+            <w:tcW w:type="dxa" w:w="3120"/>
+            <w:vAlign w:val="center"/>
+            <w:tcMar>
+              <w:top w:w="80" w:type="dxa"/>
+              <w:bottom w:w="80" w:type="dxa"/>
+              <w:start w:w="120" w:type="dxa"/>
+              <w:end w:w="120" w:type="dxa"/>
+            </w:tcMar>
+          </w:tcPr>
+          <w:p>
+            <w:r>
+              <w:rPr>
+                <w:rFonts w:ascii="Calibri" w:hAnsi="Calibri"/>
+                <w:b w:val="0"/>
+                <w:color w:val="000000"/>
+                <w:sz w:val="22"/>
+              </w:rPr>
+              <w:t>Jelölés: __________________</w:t>
+            </w:r>
+          </w:p>
+        </w:tc>
+        <w:tc>
+          <w:tcPr>
+            <w:tcW w:type="dxa" w:w="3120"/>
             <w:vAlign w:val="center"/>
             <w:tcMar>
               <w:top w:w="80" w:type="dxa"/>
@@ -917,6 +1468,11 @@
         </w:tc>
       </w:tr>
     </w:tbl>
+    <w:p>
+      <w:r>
+        <w:t>Az aláírás önmagában nem pótolja a felsorolt vizsgálatot, mellékletet, védett tárhivatkozást vagy technikai tesztet. A döntés csak a ténylegesen rendelkezésre álló és ellenőrzött anyagokra vonatkozhat.</w:t>
+      </w:r>
+    </w:p>
     <w:p>
       <w:pPr>
         <w:pStyle w:val="Heading2"/>
@@ -1158,6 +1714,9 @@
         <w:gridCol w:w="4680"/>
       </w:tblGrid>
       <w:tr>
+        <w:trPr>
+          <w:cantSplit/>
+        </w:trPr>
         <w:tc>
           <w:tcPr>
             <w:tcW w:type="dxa" w:w="4680"/>
@@ -1171,6 +1730,9 @@
             <w:shd w:fill="F2F4F7"/>
           </w:tcPr>
           <w:p>
+            <w:pPr>
+              <w:keepNext/>
+            </w:pPr>
             <w:r>
               <w:rPr>
                 <w:rFonts w:ascii="Calibri" w:hAnsi="Calibri"/>
@@ -1195,6 +1757,9 @@
             <w:shd w:fill="F2F4F7"/>
           </w:tcPr>
           <w:p>
+            <w:pPr>
+              <w:keepNext/>
+            </w:pPr>
             <w:r>
               <w:rPr>
                 <w:rFonts w:ascii="Calibri" w:hAnsi="Calibri"/>
@@ -1208,6 +1773,9 @@
         </w:tc>
       </w:tr>
       <w:tr>
+        <w:trPr>
+          <w:cantSplit/>
+        </w:trPr>
         <w:tc>
           <w:tcPr>
             <w:tcW w:type="dxa" w:w="4680"/>
@@ -1228,6 +1796,16 @@
                 <w:sz w:val="22"/>
               </w:rPr>
               <w:t>Név: ______________________________</w:t>
+            </w:r>
+            <w:r>
+              <w:rPr>
+                <w:rFonts w:ascii="Calibri" w:hAnsi="Calibri"/>
+                <w:b w:val="0"/>
+                <w:color w:val="000000"/>
+                <w:sz w:val="22"/>
+              </w:rPr>
+              <w:br/>
+              <w:t>Dátum, aláírás: ____________________</w:t>
             </w:r>
           </w:p>
         </w:tc>
@@ -1252,22 +1830,6 @@
               </w:rPr>
               <w:t>Név: ______________________________</w:t>
             </w:r>
-          </w:p>
-        </w:tc>
-      </w:tr>
-      <w:tr>
-        <w:tc>
-          <w:tcPr>
-            <w:tcW w:type="dxa" w:w="4680"/>
-            <w:vAlign w:val="center"/>
-            <w:tcMar>
-              <w:top w:w="80" w:type="dxa"/>
-              <w:bottom w:w="80" w:type="dxa"/>
-              <w:start w:w="120" w:type="dxa"/>
-              <w:end w:w="120" w:type="dxa"/>
-            </w:tcMar>
-          </w:tcPr>
-          <w:p>
             <w:r>
               <w:rPr>
                 <w:rFonts w:ascii="Calibri" w:hAnsi="Calibri"/>
@@ -1275,29 +1837,7 @@
                 <w:color w:val="000000"/>
                 <w:sz w:val="22"/>
               </w:rPr>
-              <w:t>Dátum, aláírás: ____________________</w:t>
-            </w:r>
-          </w:p>
-        </w:tc>
-        <w:tc>
-          <w:tcPr>
-            <w:tcW w:type="dxa" w:w="4680"/>
-            <w:vAlign w:val="center"/>
-            <w:tcMar>
-              <w:top w:w="80" w:type="dxa"/>
-              <w:bottom w:w="80" w:type="dxa"/>
-              <w:start w:w="120" w:type="dxa"/>
-              <w:end w:w="120" w:type="dxa"/>
-            </w:tcMar>
-          </w:tcPr>
-          <w:p>
-            <w:r>
-              <w:rPr>
-                <w:rFonts w:ascii="Calibri" w:hAnsi="Calibri"/>
-                <w:b w:val="0"/>
-                <w:color w:val="000000"/>
-                <w:sz w:val="22"/>
-              </w:rPr>
+              <w:br/>
               <w:t>Dátum, aláírás: ____________________</w:t>
             </w:r>
           </w:p>

</xml_diff>